<commit_message>
Prepare Navigator v6.0 Build 027 release
</commit_message>
<xml_diff>
--- a/docs/guides/VCL2FMXConverter_v6_0_Navigator_Application_Inventory.docx
+++ b/docs/guides/VCL2FMXConverter_v6_0_Navigator_Application_Inventory.docx
@@ -1,6 +1,6 @@
 
 <file path=word/document.xml><?xml version="1.0" encoding="utf-8"?>
-<w:document xmlns:wpc="http://schemas.microsoft.com/office/word/2010/wordprocessingCanvas" xmlns:cx="http://schemas.microsoft.com/office/drawing/2014/chartex" xmlns:cx1="http://schemas.microsoft.com/office/drawing/2015/9/8/chartex" xmlns:cx2="http://schemas.microsoft.com/office/drawing/2015/10/21/chartex" xmlns:cx3="http://schemas.microsoft.com/office/drawing/2016/5/9/chartex" xmlns:cx4="http://schemas.microsoft.com/office/drawing/2016/5/10/chartex" xmlns:cx5="http://schemas.microsoft.com/office/drawing/2016/5/11/chartex" xmlns:cx6="http://schemas.microsoft.com/office/drawing/2016/5/12/chartex" xmlns:cx7="http://schemas.microsoft.com/office/drawing/2016/5/13/chartex" xmlns:cx8="http://schemas.microsoft.com/office/drawing/2016/5/14/chartex" xmlns:mc="http://schemas.openxmlformats.org/markup-compatibility/2006" xmlns:aink="http://schemas.microsoft.com/office/drawing/2016/ink" xmlns:am3d="http://schemas.microsoft.com/office/drawing/2017/model3d" xmlns:o="urn:schemas-microsoft-com:office:office" xmlns:oel="http://schemas.microsoft.com/office/2019/extlst" xmlns:r="http://schemas.openxmlformats.org/officeDocument/2006/relationships" xmlns:m="http://schemas.openxmlformats.org/officeDocument/2006/math" xmlns:v="urn:schemas-microsoft-com:vml" xmlns:wp14="http://schemas.microsoft.com/office/word/2010/wordprocessingDrawing" xmlns:wp="http://schemas.openxmlformats.org/drawingml/2006/wordprocessingDrawing" xmlns:w10="urn:schemas-microsoft-com:office:word" xmlns:w="http://schemas.openxmlformats.org/wordprocessingml/2006/main" xmlns:w14="http://schemas.microsoft.com/office/word/2010/wordml" xmlns:w15="http://schemas.microsoft.com/office/word/2012/wordml" xmlns:w16cei="http://schemas.microsoft.com/office/word/2026/wordml/cei" xmlns:w16cex="http://schemas.microsoft.com/office/word/2018/wordml/cex" xmlns:w16cid="http://schemas.microsoft.com/office/word/2016/wordml/cid" xmlns:w16="http://schemas.microsoft.com/office/word/2018/wordml" xmlns:w16du="http://schemas.microsoft.com/office/word/2023/wordml/word16du" xmlns:w16sdtdh="http://schemas.microsoft.com/office/word/2020/wordml/sdtdatahash" xmlns:w16sdtfl="http://schemas.microsoft.com/office/word/2024/wordml/sdtformatlock" xmlns:w16se="http://schemas.microsoft.com/office/word/2015/wordml/symex" xmlns:wpg="http://schemas.microsoft.com/office/word/2010/wordprocessingGroup" xmlns:wpi="http://schemas.microsoft.com/office/word/2010/wordprocessingInk" xmlns:wne="http://schemas.microsoft.com/office/word/2006/wordml" xmlns:wps="http://schemas.microsoft.com/office/word/2010/wordprocessingShape" mc:Ignorable="w14 w15 w16se w16cid w16 w16cex w16sdtdh w16sdtfl w16du wp14">
+<w:document xmlns:wpc="http://schemas.microsoft.com/office/word/2010/wordprocessingCanvas" xmlns:cx="http://schemas.microsoft.com/office/drawing/2014/chartex" xmlns:cx1="http://schemas.microsoft.com/office/drawing/2015/9/8/chartex" xmlns:cx2="http://schemas.microsoft.com/office/drawing/2015/10/21/chartex" xmlns:cx3="http://schemas.microsoft.com/office/drawing/2016/5/9/chartex" xmlns:cx4="http://schemas.microsoft.com/office/drawing/2016/5/10/chartex" xmlns:cx5="http://schemas.microsoft.com/office/drawing/2016/5/11/chartex" xmlns:cx6="http://schemas.microsoft.com/office/drawing/2016/5/12/chartex" xmlns:cx7="http://schemas.microsoft.com/office/drawing/2016/5/13/chartex" xmlns:cx8="http://schemas.microsoft.com/office/drawing/2016/5/14/chartex" xmlns:mc="http://schemas.openxmlformats.org/markup-compatibility/2006" xmlns:aink="http://schemas.microsoft.com/office/drawing/2016/ink" xmlns:am3d="http://schemas.microsoft.com/office/drawing/2017/model3d" xmlns:o="urn:schemas-microsoft-com:office:office" xmlns:oel="http://schemas.microsoft.com/office/2019/extlst" xmlns:r="http://schemas.openxmlformats.org/officeDocument/2006/relationships" xmlns:m="http://schemas.openxmlformats.org/officeDocument/2006/math" xmlns:v="urn:schemas-microsoft-com:vml" xmlns:wp14="http://schemas.microsoft.com/office/word/2010/wordprocessingDrawing" xmlns:wp="http://schemas.openxmlformats.org/drawingml/2006/wordprocessingDrawing" xmlns:w10="urn:schemas-microsoft-com:office:word" xmlns:w="http://schemas.openxmlformats.org/wordprocessingml/2006/main" xmlns:w14="http://schemas.microsoft.com/office/word/2010/wordml" xmlns:w15="http://schemas.microsoft.com/office/word/2012/wordml" xmlns:w16cex="http://schemas.microsoft.com/office/word/2018/wordml/cex" xmlns:w16cid="http://schemas.microsoft.com/office/word/2016/wordml/cid" xmlns:w16="http://schemas.microsoft.com/office/word/2018/wordml" xmlns:w16du="http://schemas.microsoft.com/office/word/2023/wordml/word16du" xmlns:w16sdtdh="http://schemas.microsoft.com/office/word/2020/wordml/sdtdatahash" xmlns:w16sdtfl="http://schemas.microsoft.com/office/word/2024/wordml/sdtformatlock" xmlns:w16se="http://schemas.microsoft.com/office/word/2015/wordml/symex" xmlns:wpg="http://schemas.microsoft.com/office/word/2010/wordprocessingGroup" xmlns:wpi="http://schemas.microsoft.com/office/word/2010/wordprocessingInk" xmlns:wne="http://schemas.microsoft.com/office/word/2006/wordml" xmlns:wps="http://schemas.microsoft.com/office/word/2010/wordprocessingShape" mc:Ignorable="w14 w15 w16se w16cid w16 w16cex w16sdtdh w16sdtfl w16du wp14">
   <w:body>
     <w:p>
       <w:pPr>
@@ -171,15 +171,7 @@
           <w:color w:val="173B65"/>
           <w:sz w:val="20"/>
         </w:rPr>
-        <w:t xml:space="preserve">Prepared </w:t>
-      </w:r>
-      <w:r>
-        <w:rPr>
-          <w:b/>
-          <w:color w:val="173B65"/>
-          <w:sz w:val="20"/>
-        </w:rPr>
-        <w:t>August 3, 2026</w:t>
+        <w:t>Prepared September 2, 2026</w:t>
       </w:r>
     </w:p>
     <w:p>
@@ -447,7 +439,7 @@
                 <w:color w:val="2478D4"/>
                 <w:sz w:val="34"/>
               </w:rPr>
-              <w:t>65</w:t>
+              <w:t>66</w:t>
             </w:r>
           </w:p>
           <w:p>
@@ -6262,7 +6254,7 @@
               <w:rPr>
                 <w:sz w:val="19"/>
               </w:rPr>
-              <w:t>65</w:t>
+              <w:t>66</w:t>
             </w:r>
           </w:p>
         </w:tc>
@@ -6742,7 +6734,7 @@
               <w:rPr>
                 <w:sz w:val="18"/>
               </w:rPr>
-              <w:t>2 HTML pages; approximately 750 lines across pages, CSS, and JavaScript</w:t>
+              <w:t>5 HTML pages; approximately 2,020 lines across pages, CSS, and JavaScript</w:t>
             </w:r>
           </w:p>
         </w:tc>
@@ -7105,7 +7097,7 @@
               <w:rPr>
                 <w:sz w:val="15"/>
               </w:rPr>
-              <w:t>13,353,472 bytes</w:t>
+              <w:t>13,355,008 bytes</w:t>
             </w:r>
           </w:p>
         </w:tc>
@@ -7128,7 +7120,7 @@
               <w:rPr>
                 <w:sz w:val="15"/>
               </w:rPr>
-              <w:t>7FA1B5F3D5DB980C1A4BFF37EA64C98321546D1D009E882D8818D835E2E01BE7</w:t>
+              <w:t>50D3EBB1B5CD61DE90D048BD39C162641437036343145E464F32A78B195D23B8</w:t>
             </w:r>
           </w:p>
         </w:tc>
@@ -7182,7 +7174,7 @@
               <w:rPr>
                 <w:sz w:val="15"/>
               </w:rPr>
-              <w:t>18,879,488 bytes</w:t>
+              <w:t>18,881,024 bytes</w:t>
             </w:r>
           </w:p>
         </w:tc>
@@ -7206,7 +7198,7 @@
               <w:rPr>
                 <w:sz w:val="15"/>
               </w:rPr>
-              <w:t>18722CF7089A94621F91EF0F86410BDC1C36908FDECE5106042D33BFA0C7E3C6</w:t>
+              <w:t>526869EBC6D3439EAFF32CACCBCAF1949696ECB1AF6F3BDAC1A35BD2167990D3</w:t>
             </w:r>
           </w:p>
         </w:tc>
@@ -7258,7 +7250,7 @@
               <w:rPr>
                 <w:sz w:val="15"/>
               </w:rPr>
-              <w:t>720,375 bytes</w:t>
+              <w:t>748,508 bytes</w:t>
             </w:r>
           </w:p>
         </w:tc>
@@ -7281,7 +7273,7 @@
               <w:rPr>
                 <w:sz w:val="15"/>
               </w:rPr>
-              <w:t>313D554E4B2C0067D46427AA94B6919343C1CA45AFEC40D416723658A85A00B2</w:t>
+              <w:t>C313C52C737BEFE484A33D330B792324DD30F188E7B2F69F2D173CB4B3A5EFDD</w:t>
             </w:r>
           </w:p>
         </w:tc>
@@ -7310,7 +7302,7 @@
           <w:color w:val="173B65"/>
           <w:sz w:val="19"/>
         </w:rPr>
-        <w:t>VCL2FMXConverter_v6_0_Navigator_Source_Distribution_2026-08-03_120124.zip</w:t>
+        <w:t>VCL2FMXConverter_v6_0_Navigator_Build027_Source_Distribution_2026-09-02_151952.zip</w:t>
       </w:r>
     </w:p>
     <w:p>
@@ -7761,7 +7753,7 @@
               <w:rPr>
                 <w:color w:val="173B65"/>
               </w:rPr>
-              <w:t>Validated local release candidate</w:t>
+              <w:t>Released</w:t>
             </w:r>
             <w:r>
               <w:rPr>
@@ -7773,7 +7765,7 @@
               <w:rPr>
                 <w:color w:val="173B65"/>
               </w:rPr>
-              <w:t>August 3, 2026</w:t>
+              <w:t>September 2, 2026</w:t>
             </w:r>
           </w:p>
         </w:tc>
@@ -7801,7 +7793,7 @@
 </file>
 
 <file path=word/endnotes.xml><?xml version="1.0" encoding="utf-8"?>
-<w:endnotes xmlns:wpc="http://schemas.microsoft.com/office/word/2010/wordprocessingCanvas" xmlns:cx="http://schemas.microsoft.com/office/drawing/2014/chartex" xmlns:cx1="http://schemas.microsoft.com/office/drawing/2015/9/8/chartex" xmlns:cx2="http://schemas.microsoft.com/office/drawing/2015/10/21/chartex" xmlns:cx3="http://schemas.microsoft.com/office/drawing/2016/5/9/chartex" xmlns:cx4="http://schemas.microsoft.com/office/drawing/2016/5/10/chartex" xmlns:cx5="http://schemas.microsoft.com/office/drawing/2016/5/11/chartex" xmlns:cx6="http://schemas.microsoft.com/office/drawing/2016/5/12/chartex" xmlns:cx7="http://schemas.microsoft.com/office/drawing/2016/5/13/chartex" xmlns:cx8="http://schemas.microsoft.com/office/drawing/2016/5/14/chartex" xmlns:mc="http://schemas.openxmlformats.org/markup-compatibility/2006" xmlns:aink="http://schemas.microsoft.com/office/drawing/2016/ink" xmlns:am3d="http://schemas.microsoft.com/office/drawing/2017/model3d" xmlns:o="urn:schemas-microsoft-com:office:office" xmlns:oel="http://schemas.microsoft.com/office/2019/extlst" xmlns:r="http://schemas.openxmlformats.org/officeDocument/2006/relationships" xmlns:m="http://schemas.openxmlformats.org/officeDocument/2006/math" xmlns:v="urn:schemas-microsoft-com:vml" xmlns:wp14="http://schemas.microsoft.com/office/word/2010/wordprocessingDrawing" xmlns:wp="http://schemas.openxmlformats.org/drawingml/2006/wordprocessingDrawing" xmlns:w10="urn:schemas-microsoft-com:office:word" xmlns:w="http://schemas.openxmlformats.org/wordprocessingml/2006/main" xmlns:w14="http://schemas.microsoft.com/office/word/2010/wordml" xmlns:w15="http://schemas.microsoft.com/office/word/2012/wordml" xmlns:w16cei="http://schemas.microsoft.com/office/word/2026/wordml/cei" xmlns:w16cex="http://schemas.microsoft.com/office/word/2018/wordml/cex" xmlns:w16cid="http://schemas.microsoft.com/office/word/2016/wordml/cid" xmlns:w16="http://schemas.microsoft.com/office/word/2018/wordml" xmlns:w16du="http://schemas.microsoft.com/office/word/2023/wordml/word16du" xmlns:w16sdtdh="http://schemas.microsoft.com/office/word/2020/wordml/sdtdatahash" xmlns:w16sdtfl="http://schemas.microsoft.com/office/word/2024/wordml/sdtformatlock" xmlns:w16se="http://schemas.microsoft.com/office/word/2015/wordml/symex" xmlns:wpg="http://schemas.microsoft.com/office/word/2010/wordprocessingGroup" xmlns:wpi="http://schemas.microsoft.com/office/word/2010/wordprocessingInk" xmlns:wne="http://schemas.microsoft.com/office/word/2006/wordml" xmlns:wps="http://schemas.microsoft.com/office/word/2010/wordprocessingShape" mc:Ignorable="w14 w15 w16se w16cid w16 w16cex w16sdtdh w16sdtfl w16du wp14">
+<w:endnotes xmlns:wpc="http://schemas.microsoft.com/office/word/2010/wordprocessingCanvas" xmlns:cx="http://schemas.microsoft.com/office/drawing/2014/chartex" xmlns:cx1="http://schemas.microsoft.com/office/drawing/2015/9/8/chartex" xmlns:cx2="http://schemas.microsoft.com/office/drawing/2015/10/21/chartex" xmlns:cx3="http://schemas.microsoft.com/office/drawing/2016/5/9/chartex" xmlns:cx4="http://schemas.microsoft.com/office/drawing/2016/5/10/chartex" xmlns:cx5="http://schemas.microsoft.com/office/drawing/2016/5/11/chartex" xmlns:cx6="http://schemas.microsoft.com/office/drawing/2016/5/12/chartex" xmlns:cx7="http://schemas.microsoft.com/office/drawing/2016/5/13/chartex" xmlns:cx8="http://schemas.microsoft.com/office/drawing/2016/5/14/chartex" xmlns:mc="http://schemas.openxmlformats.org/markup-compatibility/2006" xmlns:aink="http://schemas.microsoft.com/office/drawing/2016/ink" xmlns:am3d="http://schemas.microsoft.com/office/drawing/2017/model3d" xmlns:o="urn:schemas-microsoft-com:office:office" xmlns:oel="http://schemas.microsoft.com/office/2019/extlst" xmlns:r="http://schemas.openxmlformats.org/officeDocument/2006/relationships" xmlns:m="http://schemas.openxmlformats.org/officeDocument/2006/math" xmlns:v="urn:schemas-microsoft-com:vml" xmlns:wp14="http://schemas.microsoft.com/office/word/2010/wordprocessingDrawing" xmlns:wp="http://schemas.openxmlformats.org/drawingml/2006/wordprocessingDrawing" xmlns:w10="urn:schemas-microsoft-com:office:word" xmlns:w="http://schemas.openxmlformats.org/wordprocessingml/2006/main" xmlns:w14="http://schemas.microsoft.com/office/word/2010/wordml" xmlns:w15="http://schemas.microsoft.com/office/word/2012/wordml" xmlns:w16cex="http://schemas.microsoft.com/office/word/2018/wordml/cex" xmlns:w16cid="http://schemas.microsoft.com/office/word/2016/wordml/cid" xmlns:w16="http://schemas.microsoft.com/office/word/2018/wordml" xmlns:w16du="http://schemas.microsoft.com/office/word/2023/wordml/word16du" xmlns:w16sdtdh="http://schemas.microsoft.com/office/word/2020/wordml/sdtdatahash" xmlns:w16sdtfl="http://schemas.microsoft.com/office/word/2024/wordml/sdtformatlock" xmlns:w16se="http://schemas.microsoft.com/office/word/2015/wordml/symex" xmlns:wpg="http://schemas.microsoft.com/office/word/2010/wordprocessingGroup" xmlns:wpi="http://schemas.microsoft.com/office/word/2010/wordprocessingInk" xmlns:wne="http://schemas.microsoft.com/office/word/2006/wordml" xmlns:wps="http://schemas.microsoft.com/office/word/2010/wordprocessingShape" mc:Ignorable="w14 w15 w16se w16cid w16 w16cex w16sdtdh w16sdtfl w16du wp14">
   <w:endnote w:type="separator" w:id="-1">
     <w:p>
       <w:pPr>
@@ -7826,7 +7818,7 @@
 </file>
 
 <file path=word/footer1.xml><?xml version="1.0" encoding="utf-8"?>
-<w:ftr xmlns:wpc="http://schemas.microsoft.com/office/word/2010/wordprocessingCanvas" xmlns:cx="http://schemas.microsoft.com/office/drawing/2014/chartex" xmlns:cx1="http://schemas.microsoft.com/office/drawing/2015/9/8/chartex" xmlns:cx2="http://schemas.microsoft.com/office/drawing/2015/10/21/chartex" xmlns:cx3="http://schemas.microsoft.com/office/drawing/2016/5/9/chartex" xmlns:cx4="http://schemas.microsoft.com/office/drawing/2016/5/10/chartex" xmlns:cx5="http://schemas.microsoft.com/office/drawing/2016/5/11/chartex" xmlns:cx6="http://schemas.microsoft.com/office/drawing/2016/5/12/chartex" xmlns:cx7="http://schemas.microsoft.com/office/drawing/2016/5/13/chartex" xmlns:cx8="http://schemas.microsoft.com/office/drawing/2016/5/14/chartex" xmlns:mc="http://schemas.openxmlformats.org/markup-compatibility/2006" xmlns:aink="http://schemas.microsoft.com/office/drawing/2016/ink" xmlns:am3d="http://schemas.microsoft.com/office/drawing/2017/model3d" xmlns:o="urn:schemas-microsoft-com:office:office" xmlns:oel="http://schemas.microsoft.com/office/2019/extlst" xmlns:r="http://schemas.openxmlformats.org/officeDocument/2006/relationships" xmlns:m="http://schemas.openxmlformats.org/officeDocument/2006/math" xmlns:v="urn:schemas-microsoft-com:vml" xmlns:wp14="http://schemas.microsoft.com/office/word/2010/wordprocessingDrawing" xmlns:wp="http://schemas.openxmlformats.org/drawingml/2006/wordprocessingDrawing" xmlns:w10="urn:schemas-microsoft-com:office:word" xmlns:w="http://schemas.openxmlformats.org/wordprocessingml/2006/main" xmlns:w14="http://schemas.microsoft.com/office/word/2010/wordml" xmlns:w15="http://schemas.microsoft.com/office/word/2012/wordml" xmlns:w16cei="http://schemas.microsoft.com/office/word/2026/wordml/cei" xmlns:w16cex="http://schemas.microsoft.com/office/word/2018/wordml/cex" xmlns:w16cid="http://schemas.microsoft.com/office/word/2016/wordml/cid" xmlns:w16="http://schemas.microsoft.com/office/word/2018/wordml" xmlns:w16du="http://schemas.microsoft.com/office/word/2023/wordml/word16du" xmlns:w16sdtdh="http://schemas.microsoft.com/office/word/2020/wordml/sdtdatahash" xmlns:w16sdtfl="http://schemas.microsoft.com/office/word/2024/wordml/sdtformatlock" xmlns:w16se="http://schemas.microsoft.com/office/word/2015/wordml/symex" xmlns:wpg="http://schemas.microsoft.com/office/word/2010/wordprocessingGroup" xmlns:wpi="http://schemas.microsoft.com/office/word/2010/wordprocessingInk" xmlns:wne="http://schemas.microsoft.com/office/word/2006/wordml" xmlns:wps="http://schemas.microsoft.com/office/word/2010/wordprocessingShape" mc:Ignorable="w14 w15 w16se w16cid w16 w16cex w16sdtdh w16sdtfl w16du wp14">
+<w:ftr xmlns:wpc="http://schemas.microsoft.com/office/word/2010/wordprocessingCanvas" xmlns:cx="http://schemas.microsoft.com/office/drawing/2014/chartex" xmlns:cx1="http://schemas.microsoft.com/office/drawing/2015/9/8/chartex" xmlns:cx2="http://schemas.microsoft.com/office/drawing/2015/10/21/chartex" xmlns:cx3="http://schemas.microsoft.com/office/drawing/2016/5/9/chartex" xmlns:cx4="http://schemas.microsoft.com/office/drawing/2016/5/10/chartex" xmlns:cx5="http://schemas.microsoft.com/office/drawing/2016/5/11/chartex" xmlns:cx6="http://schemas.microsoft.com/office/drawing/2016/5/12/chartex" xmlns:cx7="http://schemas.microsoft.com/office/drawing/2016/5/13/chartex" xmlns:cx8="http://schemas.microsoft.com/office/drawing/2016/5/14/chartex" xmlns:mc="http://schemas.openxmlformats.org/markup-compatibility/2006" xmlns:aink="http://schemas.microsoft.com/office/drawing/2016/ink" xmlns:am3d="http://schemas.microsoft.com/office/drawing/2017/model3d" xmlns:o="urn:schemas-microsoft-com:office:office" xmlns:oel="http://schemas.microsoft.com/office/2019/extlst" xmlns:r="http://schemas.openxmlformats.org/officeDocument/2006/relationships" xmlns:m="http://schemas.openxmlformats.org/officeDocument/2006/math" xmlns:v="urn:schemas-microsoft-com:vml" xmlns:wp14="http://schemas.microsoft.com/office/word/2010/wordprocessingDrawing" xmlns:wp="http://schemas.openxmlformats.org/drawingml/2006/wordprocessingDrawing" xmlns:w10="urn:schemas-microsoft-com:office:word" xmlns:w="http://schemas.openxmlformats.org/wordprocessingml/2006/main" xmlns:w14="http://schemas.microsoft.com/office/word/2010/wordml" xmlns:w15="http://schemas.microsoft.com/office/word/2012/wordml" xmlns:w16cex="http://schemas.microsoft.com/office/word/2018/wordml/cex" xmlns:w16cid="http://schemas.microsoft.com/office/word/2016/wordml/cid" xmlns:w16="http://schemas.microsoft.com/office/word/2018/wordml" xmlns:w16du="http://schemas.microsoft.com/office/word/2023/wordml/word16du" xmlns:w16sdtdh="http://schemas.microsoft.com/office/word/2020/wordml/sdtdatahash" xmlns:w16sdtfl="http://schemas.microsoft.com/office/word/2024/wordml/sdtformatlock" xmlns:w16se="http://schemas.microsoft.com/office/word/2015/wordml/symex" xmlns:wpg="http://schemas.microsoft.com/office/word/2010/wordprocessingGroup" xmlns:wpi="http://schemas.microsoft.com/office/word/2010/wordprocessingInk" xmlns:wne="http://schemas.microsoft.com/office/word/2006/wordml" xmlns:wps="http://schemas.microsoft.com/office/word/2010/wordprocessingShape" mc:Ignorable="w14 w15 w16se w16cid w16 w16cex w16sdtdh w16sdtfl w16du wp14">
   <w:p>
     <w:pPr>
       <w:pStyle w:val="Footer"/>
@@ -7836,7 +7828,7 @@
 </file>
 
 <file path=word/footer2.xml><?xml version="1.0" encoding="utf-8"?>
-<w:ftr xmlns:wpc="http://schemas.microsoft.com/office/word/2010/wordprocessingCanvas" xmlns:cx="http://schemas.microsoft.com/office/drawing/2014/chartex" xmlns:cx1="http://schemas.microsoft.com/office/drawing/2015/9/8/chartex" xmlns:cx2="http://schemas.microsoft.com/office/drawing/2015/10/21/chartex" xmlns:cx3="http://schemas.microsoft.com/office/drawing/2016/5/9/chartex" xmlns:cx4="http://schemas.microsoft.com/office/drawing/2016/5/10/chartex" xmlns:cx5="http://schemas.microsoft.com/office/drawing/2016/5/11/chartex" xmlns:cx6="http://schemas.microsoft.com/office/drawing/2016/5/12/chartex" xmlns:cx7="http://schemas.microsoft.com/office/drawing/2016/5/13/chartex" xmlns:cx8="http://schemas.microsoft.com/office/drawing/2016/5/14/chartex" xmlns:mc="http://schemas.openxmlformats.org/markup-compatibility/2006" xmlns:aink="http://schemas.microsoft.com/office/drawing/2016/ink" xmlns:am3d="http://schemas.microsoft.com/office/drawing/2017/model3d" xmlns:o="urn:schemas-microsoft-com:office:office" xmlns:oel="http://schemas.microsoft.com/office/2019/extlst" xmlns:r="http://schemas.openxmlformats.org/officeDocument/2006/relationships" xmlns:m="http://schemas.openxmlformats.org/officeDocument/2006/math" xmlns:v="urn:schemas-microsoft-com:vml" xmlns:wp14="http://schemas.microsoft.com/office/word/2010/wordprocessingDrawing" xmlns:wp="http://schemas.openxmlformats.org/drawingml/2006/wordprocessingDrawing" xmlns:w10="urn:schemas-microsoft-com:office:word" xmlns:w="http://schemas.openxmlformats.org/wordprocessingml/2006/main" xmlns:w14="http://schemas.microsoft.com/office/word/2010/wordml" xmlns:w15="http://schemas.microsoft.com/office/word/2012/wordml" xmlns:w16cei="http://schemas.microsoft.com/office/word/2026/wordml/cei" xmlns:w16cex="http://schemas.microsoft.com/office/word/2018/wordml/cex" xmlns:w16cid="http://schemas.microsoft.com/office/word/2016/wordml/cid" xmlns:w16="http://schemas.microsoft.com/office/word/2018/wordml" xmlns:w16du="http://schemas.microsoft.com/office/word/2023/wordml/word16du" xmlns:w16sdtdh="http://schemas.microsoft.com/office/word/2020/wordml/sdtdatahash" xmlns:w16sdtfl="http://schemas.microsoft.com/office/word/2024/wordml/sdtformatlock" xmlns:w16se="http://schemas.microsoft.com/office/word/2015/wordml/symex" xmlns:wpg="http://schemas.microsoft.com/office/word/2010/wordprocessingGroup" xmlns:wpi="http://schemas.microsoft.com/office/word/2010/wordprocessingInk" xmlns:wne="http://schemas.microsoft.com/office/word/2006/wordml" xmlns:wps="http://schemas.microsoft.com/office/word/2010/wordprocessingShape" mc:Ignorable="w14 w15 w16se w16cid w16 w16cex w16sdtdh w16sdtfl w16du wp14">
+<w:ftr xmlns:wpc="http://schemas.microsoft.com/office/word/2010/wordprocessingCanvas" xmlns:cx="http://schemas.microsoft.com/office/drawing/2014/chartex" xmlns:cx1="http://schemas.microsoft.com/office/drawing/2015/9/8/chartex" xmlns:cx2="http://schemas.microsoft.com/office/drawing/2015/10/21/chartex" xmlns:cx3="http://schemas.microsoft.com/office/drawing/2016/5/9/chartex" xmlns:cx4="http://schemas.microsoft.com/office/drawing/2016/5/10/chartex" xmlns:cx5="http://schemas.microsoft.com/office/drawing/2016/5/11/chartex" xmlns:cx6="http://schemas.microsoft.com/office/drawing/2016/5/12/chartex" xmlns:cx7="http://schemas.microsoft.com/office/drawing/2016/5/13/chartex" xmlns:cx8="http://schemas.microsoft.com/office/drawing/2016/5/14/chartex" xmlns:mc="http://schemas.openxmlformats.org/markup-compatibility/2006" xmlns:aink="http://schemas.microsoft.com/office/drawing/2016/ink" xmlns:am3d="http://schemas.microsoft.com/office/drawing/2017/model3d" xmlns:o="urn:schemas-microsoft-com:office:office" xmlns:oel="http://schemas.microsoft.com/office/2019/extlst" xmlns:r="http://schemas.openxmlformats.org/officeDocument/2006/relationships" xmlns:m="http://schemas.openxmlformats.org/officeDocument/2006/math" xmlns:v="urn:schemas-microsoft-com:vml" xmlns:wp14="http://schemas.microsoft.com/office/word/2010/wordprocessingDrawing" xmlns:wp="http://schemas.openxmlformats.org/drawingml/2006/wordprocessingDrawing" xmlns:w10="urn:schemas-microsoft-com:office:word" xmlns:w="http://schemas.openxmlformats.org/wordprocessingml/2006/main" xmlns:w14="http://schemas.microsoft.com/office/word/2010/wordml" xmlns:w15="http://schemas.microsoft.com/office/word/2012/wordml" xmlns:w16cex="http://schemas.microsoft.com/office/word/2018/wordml/cex" xmlns:w16cid="http://schemas.microsoft.com/office/word/2016/wordml/cid" xmlns:w16="http://schemas.microsoft.com/office/word/2018/wordml" xmlns:w16du="http://schemas.microsoft.com/office/word/2023/wordml/word16du" xmlns:w16sdtdh="http://schemas.microsoft.com/office/word/2020/wordml/sdtdatahash" xmlns:w16sdtfl="http://schemas.microsoft.com/office/word/2024/wordml/sdtformatlock" xmlns:w16se="http://schemas.microsoft.com/office/word/2015/wordml/symex" xmlns:wpg="http://schemas.microsoft.com/office/word/2010/wordprocessingGroup" xmlns:wpi="http://schemas.microsoft.com/office/word/2010/wordprocessingInk" xmlns:wne="http://schemas.microsoft.com/office/word/2006/wordml" xmlns:wps="http://schemas.microsoft.com/office/word/2010/wordprocessingShape" mc:Ignorable="w14 w15 w16se w16cid w16 w16cex w16sdtdh w16sdtfl w16du wp14">
   <w:p>
     <w:pPr>
       <w:pStyle w:val="Footer"/>
@@ -7870,7 +7862,7 @@
 </file>
 
 <file path=word/footer3.xml><?xml version="1.0" encoding="utf-8"?>
-<w:ftr xmlns:wpc="http://schemas.microsoft.com/office/word/2010/wordprocessingCanvas" xmlns:cx="http://schemas.microsoft.com/office/drawing/2014/chartex" xmlns:cx1="http://schemas.microsoft.com/office/drawing/2015/9/8/chartex" xmlns:cx2="http://schemas.microsoft.com/office/drawing/2015/10/21/chartex" xmlns:cx3="http://schemas.microsoft.com/office/drawing/2016/5/9/chartex" xmlns:cx4="http://schemas.microsoft.com/office/drawing/2016/5/10/chartex" xmlns:cx5="http://schemas.microsoft.com/office/drawing/2016/5/11/chartex" xmlns:cx6="http://schemas.microsoft.com/office/drawing/2016/5/12/chartex" xmlns:cx7="http://schemas.microsoft.com/office/drawing/2016/5/13/chartex" xmlns:cx8="http://schemas.microsoft.com/office/drawing/2016/5/14/chartex" xmlns:mc="http://schemas.openxmlformats.org/markup-compatibility/2006" xmlns:aink="http://schemas.microsoft.com/office/drawing/2016/ink" xmlns:am3d="http://schemas.microsoft.com/office/drawing/2017/model3d" xmlns:o="urn:schemas-microsoft-com:office:office" xmlns:oel="http://schemas.microsoft.com/office/2019/extlst" xmlns:r="http://schemas.openxmlformats.org/officeDocument/2006/relationships" xmlns:m="http://schemas.openxmlformats.org/officeDocument/2006/math" xmlns:v="urn:schemas-microsoft-com:vml" xmlns:wp14="http://schemas.microsoft.com/office/word/2010/wordprocessingDrawing" xmlns:wp="http://schemas.openxmlformats.org/drawingml/2006/wordprocessingDrawing" xmlns:w10="urn:schemas-microsoft-com:office:word" xmlns:w="http://schemas.openxmlformats.org/wordprocessingml/2006/main" xmlns:w14="http://schemas.microsoft.com/office/word/2010/wordml" xmlns:w15="http://schemas.microsoft.com/office/word/2012/wordml" xmlns:w16cei="http://schemas.microsoft.com/office/word/2026/wordml/cei" xmlns:w16cex="http://schemas.microsoft.com/office/word/2018/wordml/cex" xmlns:w16cid="http://schemas.microsoft.com/office/word/2016/wordml/cid" xmlns:w16="http://schemas.microsoft.com/office/word/2018/wordml" xmlns:w16du="http://schemas.microsoft.com/office/word/2023/wordml/word16du" xmlns:w16sdtdh="http://schemas.microsoft.com/office/word/2020/wordml/sdtdatahash" xmlns:w16sdtfl="http://schemas.microsoft.com/office/word/2024/wordml/sdtformatlock" xmlns:w16se="http://schemas.microsoft.com/office/word/2015/wordml/symex" xmlns:wpg="http://schemas.microsoft.com/office/word/2010/wordprocessingGroup" xmlns:wpi="http://schemas.microsoft.com/office/word/2010/wordprocessingInk" xmlns:wne="http://schemas.microsoft.com/office/word/2006/wordml" xmlns:wps="http://schemas.microsoft.com/office/word/2010/wordprocessingShape" mc:Ignorable="w14 w15 w16se w16cid w16 w16cex w16sdtdh w16sdtfl w16du wp14">
+<w:ftr xmlns:wpc="http://schemas.microsoft.com/office/word/2010/wordprocessingCanvas" xmlns:cx="http://schemas.microsoft.com/office/drawing/2014/chartex" xmlns:cx1="http://schemas.microsoft.com/office/drawing/2015/9/8/chartex" xmlns:cx2="http://schemas.microsoft.com/office/drawing/2015/10/21/chartex" xmlns:cx3="http://schemas.microsoft.com/office/drawing/2016/5/9/chartex" xmlns:cx4="http://schemas.microsoft.com/office/drawing/2016/5/10/chartex" xmlns:cx5="http://schemas.microsoft.com/office/drawing/2016/5/11/chartex" xmlns:cx6="http://schemas.microsoft.com/office/drawing/2016/5/12/chartex" xmlns:cx7="http://schemas.microsoft.com/office/drawing/2016/5/13/chartex" xmlns:cx8="http://schemas.microsoft.com/office/drawing/2016/5/14/chartex" xmlns:mc="http://schemas.openxmlformats.org/markup-compatibility/2006" xmlns:aink="http://schemas.microsoft.com/office/drawing/2016/ink" xmlns:am3d="http://schemas.microsoft.com/office/drawing/2017/model3d" xmlns:o="urn:schemas-microsoft-com:office:office" xmlns:oel="http://schemas.microsoft.com/office/2019/extlst" xmlns:r="http://schemas.openxmlformats.org/officeDocument/2006/relationships" xmlns:m="http://schemas.openxmlformats.org/officeDocument/2006/math" xmlns:v="urn:schemas-microsoft-com:vml" xmlns:wp14="http://schemas.microsoft.com/office/word/2010/wordprocessingDrawing" xmlns:wp="http://schemas.openxmlformats.org/drawingml/2006/wordprocessingDrawing" xmlns:w10="urn:schemas-microsoft-com:office:word" xmlns:w="http://schemas.openxmlformats.org/wordprocessingml/2006/main" xmlns:w14="http://schemas.microsoft.com/office/word/2010/wordml" xmlns:w15="http://schemas.microsoft.com/office/word/2012/wordml" xmlns:w16cex="http://schemas.microsoft.com/office/word/2018/wordml/cex" xmlns:w16cid="http://schemas.microsoft.com/office/word/2016/wordml/cid" xmlns:w16="http://schemas.microsoft.com/office/word/2018/wordml" xmlns:w16du="http://schemas.microsoft.com/office/word/2023/wordml/word16du" xmlns:w16sdtdh="http://schemas.microsoft.com/office/word/2020/wordml/sdtdatahash" xmlns:w16sdtfl="http://schemas.microsoft.com/office/word/2024/wordml/sdtformatlock" xmlns:w16se="http://schemas.microsoft.com/office/word/2015/wordml/symex" xmlns:wpg="http://schemas.microsoft.com/office/word/2010/wordprocessingGroup" xmlns:wpi="http://schemas.microsoft.com/office/word/2010/wordprocessingInk" xmlns:wne="http://schemas.microsoft.com/office/word/2006/wordml" xmlns:wps="http://schemas.microsoft.com/office/word/2010/wordprocessingShape" mc:Ignorable="w14 w15 w16se w16cid w16 w16cex w16sdtdh w16sdtfl w16du wp14">
   <w:p>
     <w:pPr>
       <w:pStyle w:val="Footer"/>
@@ -7880,7 +7872,7 @@
 </file>
 
 <file path=word/footnotes.xml><?xml version="1.0" encoding="utf-8"?>
-<w:footnotes xmlns:wpc="http://schemas.microsoft.com/office/word/2010/wordprocessingCanvas" xmlns:cx="http://schemas.microsoft.com/office/drawing/2014/chartex" xmlns:cx1="http://schemas.microsoft.com/office/drawing/2015/9/8/chartex" xmlns:cx2="http://schemas.microsoft.com/office/drawing/2015/10/21/chartex" xmlns:cx3="http://schemas.microsoft.com/office/drawing/2016/5/9/chartex" xmlns:cx4="http://schemas.microsoft.com/office/drawing/2016/5/10/chartex" xmlns:cx5="http://schemas.microsoft.com/office/drawing/2016/5/11/chartex" xmlns:cx6="http://schemas.microsoft.com/office/drawing/2016/5/12/chartex" xmlns:cx7="http://schemas.microsoft.com/office/drawing/2016/5/13/chartex" xmlns:cx8="http://schemas.microsoft.com/office/drawing/2016/5/14/chartex" xmlns:mc="http://schemas.openxmlformats.org/markup-compatibility/2006" xmlns:aink="http://schemas.microsoft.com/office/drawing/2016/ink" xmlns:am3d="http://schemas.microsoft.com/office/drawing/2017/model3d" xmlns:o="urn:schemas-microsoft-com:office:office" xmlns:oel="http://schemas.microsoft.com/office/2019/extlst" xmlns:r="http://schemas.openxmlformats.org/officeDocument/2006/relationships" xmlns:m="http://schemas.openxmlformats.org/officeDocument/2006/math" xmlns:v="urn:schemas-microsoft-com:vml" xmlns:wp14="http://schemas.microsoft.com/office/word/2010/wordprocessingDrawing" xmlns:wp="http://schemas.openxmlformats.org/drawingml/2006/wordprocessingDrawing" xmlns:w10="urn:schemas-microsoft-com:office:word" xmlns:w="http://schemas.openxmlformats.org/wordprocessingml/2006/main" xmlns:w14="http://schemas.microsoft.com/office/word/2010/wordml" xmlns:w15="http://schemas.microsoft.com/office/word/2012/wordml" xmlns:w16cei="http://schemas.microsoft.com/office/word/2026/wordml/cei" xmlns:w16cex="http://schemas.microsoft.com/office/word/2018/wordml/cex" xmlns:w16cid="http://schemas.microsoft.com/office/word/2016/wordml/cid" xmlns:w16="http://schemas.microsoft.com/office/word/2018/wordml" xmlns:w16du="http://schemas.microsoft.com/office/word/2023/wordml/word16du" xmlns:w16sdtdh="http://schemas.microsoft.com/office/word/2020/wordml/sdtdatahash" xmlns:w16sdtfl="http://schemas.microsoft.com/office/word/2024/wordml/sdtformatlock" xmlns:w16se="http://schemas.microsoft.com/office/word/2015/wordml/symex" xmlns:wpg="http://schemas.microsoft.com/office/word/2010/wordprocessingGroup" xmlns:wpi="http://schemas.microsoft.com/office/word/2010/wordprocessingInk" xmlns:wne="http://schemas.microsoft.com/office/word/2006/wordml" xmlns:wps="http://schemas.microsoft.com/office/word/2010/wordprocessingShape" mc:Ignorable="w14 w15 w16se w16cid w16 w16cex w16sdtdh w16sdtfl w16du wp14">
+<w:footnotes xmlns:wpc="http://schemas.microsoft.com/office/word/2010/wordprocessingCanvas" xmlns:cx="http://schemas.microsoft.com/office/drawing/2014/chartex" xmlns:cx1="http://schemas.microsoft.com/office/drawing/2015/9/8/chartex" xmlns:cx2="http://schemas.microsoft.com/office/drawing/2015/10/21/chartex" xmlns:cx3="http://schemas.microsoft.com/office/drawing/2016/5/9/chartex" xmlns:cx4="http://schemas.microsoft.com/office/drawing/2016/5/10/chartex" xmlns:cx5="http://schemas.microsoft.com/office/drawing/2016/5/11/chartex" xmlns:cx6="http://schemas.microsoft.com/office/drawing/2016/5/12/chartex" xmlns:cx7="http://schemas.microsoft.com/office/drawing/2016/5/13/chartex" xmlns:cx8="http://schemas.microsoft.com/office/drawing/2016/5/14/chartex" xmlns:mc="http://schemas.openxmlformats.org/markup-compatibility/2006" xmlns:aink="http://schemas.microsoft.com/office/drawing/2016/ink" xmlns:am3d="http://schemas.microsoft.com/office/drawing/2017/model3d" xmlns:o="urn:schemas-microsoft-com:office:office" xmlns:oel="http://schemas.microsoft.com/office/2019/extlst" xmlns:r="http://schemas.openxmlformats.org/officeDocument/2006/relationships" xmlns:m="http://schemas.openxmlformats.org/officeDocument/2006/math" xmlns:v="urn:schemas-microsoft-com:vml" xmlns:wp14="http://schemas.microsoft.com/office/word/2010/wordprocessingDrawing" xmlns:wp="http://schemas.openxmlformats.org/drawingml/2006/wordprocessingDrawing" xmlns:w10="urn:schemas-microsoft-com:office:word" xmlns:w="http://schemas.openxmlformats.org/wordprocessingml/2006/main" xmlns:w14="http://schemas.microsoft.com/office/word/2010/wordml" xmlns:w15="http://schemas.microsoft.com/office/word/2012/wordml" xmlns:w16cex="http://schemas.microsoft.com/office/word/2018/wordml/cex" xmlns:w16cid="http://schemas.microsoft.com/office/word/2016/wordml/cid" xmlns:w16="http://schemas.microsoft.com/office/word/2018/wordml" xmlns:w16du="http://schemas.microsoft.com/office/word/2023/wordml/word16du" xmlns:w16sdtdh="http://schemas.microsoft.com/office/word/2020/wordml/sdtdatahash" xmlns:w16sdtfl="http://schemas.microsoft.com/office/word/2024/wordml/sdtformatlock" xmlns:w16se="http://schemas.microsoft.com/office/word/2015/wordml/symex" xmlns:wpg="http://schemas.microsoft.com/office/word/2010/wordprocessingGroup" xmlns:wpi="http://schemas.microsoft.com/office/word/2010/wordprocessingInk" xmlns:wne="http://schemas.microsoft.com/office/word/2006/wordml" xmlns:wps="http://schemas.microsoft.com/office/word/2010/wordprocessingShape" mc:Ignorable="w14 w15 w16se w16cid w16 w16cex w16sdtdh w16sdtfl w16du wp14">
   <w:footnote w:type="separator" w:id="-1">
     <w:p>
       <w:pPr>
@@ -7905,7 +7897,7 @@
 </file>
 
 <file path=word/header1.xml><?xml version="1.0" encoding="utf-8"?>
-<w:hdr xmlns:wpc="http://schemas.microsoft.com/office/word/2010/wordprocessingCanvas" xmlns:cx="http://schemas.microsoft.com/office/drawing/2014/chartex" xmlns:cx1="http://schemas.microsoft.com/office/drawing/2015/9/8/chartex" xmlns:cx2="http://schemas.microsoft.com/office/drawing/2015/10/21/chartex" xmlns:cx3="http://schemas.microsoft.com/office/drawing/2016/5/9/chartex" xmlns:cx4="http://schemas.microsoft.com/office/drawing/2016/5/10/chartex" xmlns:cx5="http://schemas.microsoft.com/office/drawing/2016/5/11/chartex" xmlns:cx6="http://schemas.microsoft.com/office/drawing/2016/5/12/chartex" xmlns:cx7="http://schemas.microsoft.com/office/drawing/2016/5/13/chartex" xmlns:cx8="http://schemas.microsoft.com/office/drawing/2016/5/14/chartex" xmlns:mc="http://schemas.openxmlformats.org/markup-compatibility/2006" xmlns:aink="http://schemas.microsoft.com/office/drawing/2016/ink" xmlns:am3d="http://schemas.microsoft.com/office/drawing/2017/model3d" xmlns:o="urn:schemas-microsoft-com:office:office" xmlns:oel="http://schemas.microsoft.com/office/2019/extlst" xmlns:r="http://schemas.openxmlformats.org/officeDocument/2006/relationships" xmlns:m="http://schemas.openxmlformats.org/officeDocument/2006/math" xmlns:v="urn:schemas-microsoft-com:vml" xmlns:wp14="http://schemas.microsoft.com/office/word/2010/wordprocessingDrawing" xmlns:wp="http://schemas.openxmlformats.org/drawingml/2006/wordprocessingDrawing" xmlns:w10="urn:schemas-microsoft-com:office:word" xmlns:w="http://schemas.openxmlformats.org/wordprocessingml/2006/main" xmlns:w14="http://schemas.microsoft.com/office/word/2010/wordml" xmlns:w15="http://schemas.microsoft.com/office/word/2012/wordml" xmlns:w16cei="http://schemas.microsoft.com/office/word/2026/wordml/cei" xmlns:w16cex="http://schemas.microsoft.com/office/word/2018/wordml/cex" xmlns:w16cid="http://schemas.microsoft.com/office/word/2016/wordml/cid" xmlns:w16="http://schemas.microsoft.com/office/word/2018/wordml" xmlns:w16du="http://schemas.microsoft.com/office/word/2023/wordml/word16du" xmlns:w16sdtdh="http://schemas.microsoft.com/office/word/2020/wordml/sdtdatahash" xmlns:w16sdtfl="http://schemas.microsoft.com/office/word/2024/wordml/sdtformatlock" xmlns:w16se="http://schemas.microsoft.com/office/word/2015/wordml/symex" xmlns:wpg="http://schemas.microsoft.com/office/word/2010/wordprocessingGroup" xmlns:wpi="http://schemas.microsoft.com/office/word/2010/wordprocessingInk" xmlns:wne="http://schemas.microsoft.com/office/word/2006/wordml" xmlns:wps="http://schemas.microsoft.com/office/word/2010/wordprocessingShape" mc:Ignorable="w14 w15 w16se w16cid w16 w16cex w16sdtdh w16sdtfl w16du wp14">
+<w:hdr xmlns:wpc="http://schemas.microsoft.com/office/word/2010/wordprocessingCanvas" xmlns:cx="http://schemas.microsoft.com/office/drawing/2014/chartex" xmlns:cx1="http://schemas.microsoft.com/office/drawing/2015/9/8/chartex" xmlns:cx2="http://schemas.microsoft.com/office/drawing/2015/10/21/chartex" xmlns:cx3="http://schemas.microsoft.com/office/drawing/2016/5/9/chartex" xmlns:cx4="http://schemas.microsoft.com/office/drawing/2016/5/10/chartex" xmlns:cx5="http://schemas.microsoft.com/office/drawing/2016/5/11/chartex" xmlns:cx6="http://schemas.microsoft.com/office/drawing/2016/5/12/chartex" xmlns:cx7="http://schemas.microsoft.com/office/drawing/2016/5/13/chartex" xmlns:cx8="http://schemas.microsoft.com/office/drawing/2016/5/14/chartex" xmlns:mc="http://schemas.openxmlformats.org/markup-compatibility/2006" xmlns:aink="http://schemas.microsoft.com/office/drawing/2016/ink" xmlns:am3d="http://schemas.microsoft.com/office/drawing/2017/model3d" xmlns:o="urn:schemas-microsoft-com:office:office" xmlns:oel="http://schemas.microsoft.com/office/2019/extlst" xmlns:r="http://schemas.openxmlformats.org/officeDocument/2006/relationships" xmlns:m="http://schemas.openxmlformats.org/officeDocument/2006/math" xmlns:v="urn:schemas-microsoft-com:vml" xmlns:wp14="http://schemas.microsoft.com/office/word/2010/wordprocessingDrawing" xmlns:wp="http://schemas.openxmlformats.org/drawingml/2006/wordprocessingDrawing" xmlns:w10="urn:schemas-microsoft-com:office:word" xmlns:w="http://schemas.openxmlformats.org/wordprocessingml/2006/main" xmlns:w14="http://schemas.microsoft.com/office/word/2010/wordml" xmlns:w15="http://schemas.microsoft.com/office/word/2012/wordml" xmlns:w16cex="http://schemas.microsoft.com/office/word/2018/wordml/cex" xmlns:w16cid="http://schemas.microsoft.com/office/word/2016/wordml/cid" xmlns:w16="http://schemas.microsoft.com/office/word/2018/wordml" xmlns:w16du="http://schemas.microsoft.com/office/word/2023/wordml/word16du" xmlns:w16sdtdh="http://schemas.microsoft.com/office/word/2020/wordml/sdtdatahash" xmlns:w16sdtfl="http://schemas.microsoft.com/office/word/2024/wordml/sdtformatlock" xmlns:w16se="http://schemas.microsoft.com/office/word/2015/wordml/symex" xmlns:wpg="http://schemas.microsoft.com/office/word/2010/wordprocessingGroup" xmlns:wpi="http://schemas.microsoft.com/office/word/2010/wordprocessingInk" xmlns:wne="http://schemas.microsoft.com/office/word/2006/wordml" xmlns:wps="http://schemas.microsoft.com/office/word/2010/wordprocessingShape" mc:Ignorable="w14 w15 w16se w16cid w16 w16cex w16sdtdh w16sdtfl w16du wp14">
   <w:p>
     <w:pPr>
       <w:pStyle w:val="Header"/>
@@ -7915,7 +7907,7 @@
 </file>
 
 <file path=word/header2.xml><?xml version="1.0" encoding="utf-8"?>
-<w:hdr xmlns:wpc="http://schemas.microsoft.com/office/word/2010/wordprocessingCanvas" xmlns:cx="http://schemas.microsoft.com/office/drawing/2014/chartex" xmlns:cx1="http://schemas.microsoft.com/office/drawing/2015/9/8/chartex" xmlns:cx2="http://schemas.microsoft.com/office/drawing/2015/10/21/chartex" xmlns:cx3="http://schemas.microsoft.com/office/drawing/2016/5/9/chartex" xmlns:cx4="http://schemas.microsoft.com/office/drawing/2016/5/10/chartex" xmlns:cx5="http://schemas.microsoft.com/office/drawing/2016/5/11/chartex" xmlns:cx6="http://schemas.microsoft.com/office/drawing/2016/5/12/chartex" xmlns:cx7="http://schemas.microsoft.com/office/drawing/2016/5/13/chartex" xmlns:cx8="http://schemas.microsoft.com/office/drawing/2016/5/14/chartex" xmlns:mc="http://schemas.openxmlformats.org/markup-compatibility/2006" xmlns:aink="http://schemas.microsoft.com/office/drawing/2016/ink" xmlns:am3d="http://schemas.microsoft.com/office/drawing/2017/model3d" xmlns:o="urn:schemas-microsoft-com:office:office" xmlns:oel="http://schemas.microsoft.com/office/2019/extlst" xmlns:r="http://schemas.openxmlformats.org/officeDocument/2006/relationships" xmlns:m="http://schemas.openxmlformats.org/officeDocument/2006/math" xmlns:v="urn:schemas-microsoft-com:vml" xmlns:wp14="http://schemas.microsoft.com/office/word/2010/wordprocessingDrawing" xmlns:wp="http://schemas.openxmlformats.org/drawingml/2006/wordprocessingDrawing" xmlns:w10="urn:schemas-microsoft-com:office:word" xmlns:w="http://schemas.openxmlformats.org/wordprocessingml/2006/main" xmlns:w14="http://schemas.microsoft.com/office/word/2010/wordml" xmlns:w15="http://schemas.microsoft.com/office/word/2012/wordml" xmlns:w16cei="http://schemas.microsoft.com/office/word/2026/wordml/cei" xmlns:w16cex="http://schemas.microsoft.com/office/word/2018/wordml/cex" xmlns:w16cid="http://schemas.microsoft.com/office/word/2016/wordml/cid" xmlns:w16="http://schemas.microsoft.com/office/word/2018/wordml" xmlns:w16du="http://schemas.microsoft.com/office/word/2023/wordml/word16du" xmlns:w16sdtdh="http://schemas.microsoft.com/office/word/2020/wordml/sdtdatahash" xmlns:w16sdtfl="http://schemas.microsoft.com/office/word/2024/wordml/sdtformatlock" xmlns:w16se="http://schemas.microsoft.com/office/word/2015/wordml/symex" xmlns:wpg="http://schemas.microsoft.com/office/word/2010/wordprocessingGroup" xmlns:wpi="http://schemas.microsoft.com/office/word/2010/wordprocessingInk" xmlns:wne="http://schemas.microsoft.com/office/word/2006/wordml" xmlns:wps="http://schemas.microsoft.com/office/word/2010/wordprocessingShape" mc:Ignorable="w14 w15 w16se w16cid w16 w16cex w16sdtdh w16sdtfl w16du wp14">
+<w:hdr xmlns:wpc="http://schemas.microsoft.com/office/word/2010/wordprocessingCanvas" xmlns:cx="http://schemas.microsoft.com/office/drawing/2014/chartex" xmlns:cx1="http://schemas.microsoft.com/office/drawing/2015/9/8/chartex" xmlns:cx2="http://schemas.microsoft.com/office/drawing/2015/10/21/chartex" xmlns:cx3="http://schemas.microsoft.com/office/drawing/2016/5/9/chartex" xmlns:cx4="http://schemas.microsoft.com/office/drawing/2016/5/10/chartex" xmlns:cx5="http://schemas.microsoft.com/office/drawing/2016/5/11/chartex" xmlns:cx6="http://schemas.microsoft.com/office/drawing/2016/5/12/chartex" xmlns:cx7="http://schemas.microsoft.com/office/drawing/2016/5/13/chartex" xmlns:cx8="http://schemas.microsoft.com/office/drawing/2016/5/14/chartex" xmlns:mc="http://schemas.openxmlformats.org/markup-compatibility/2006" xmlns:aink="http://schemas.microsoft.com/office/drawing/2016/ink" xmlns:am3d="http://schemas.microsoft.com/office/drawing/2017/model3d" xmlns:o="urn:schemas-microsoft-com:office:office" xmlns:oel="http://schemas.microsoft.com/office/2019/extlst" xmlns:r="http://schemas.openxmlformats.org/officeDocument/2006/relationships" xmlns:m="http://schemas.openxmlformats.org/officeDocument/2006/math" xmlns:v="urn:schemas-microsoft-com:vml" xmlns:wp14="http://schemas.microsoft.com/office/word/2010/wordprocessingDrawing" xmlns:wp="http://schemas.openxmlformats.org/drawingml/2006/wordprocessingDrawing" xmlns:w10="urn:schemas-microsoft-com:office:word" xmlns:w="http://schemas.openxmlformats.org/wordprocessingml/2006/main" xmlns:w14="http://schemas.microsoft.com/office/word/2010/wordml" xmlns:w15="http://schemas.microsoft.com/office/word/2012/wordml" xmlns:w16cex="http://schemas.microsoft.com/office/word/2018/wordml/cex" xmlns:w16cid="http://schemas.microsoft.com/office/word/2016/wordml/cid" xmlns:w16="http://schemas.microsoft.com/office/word/2018/wordml" xmlns:w16du="http://schemas.microsoft.com/office/word/2023/wordml/word16du" xmlns:w16sdtdh="http://schemas.microsoft.com/office/word/2020/wordml/sdtdatahash" xmlns:w16sdtfl="http://schemas.microsoft.com/office/word/2024/wordml/sdtformatlock" xmlns:w16se="http://schemas.microsoft.com/office/word/2015/wordml/symex" xmlns:wpg="http://schemas.microsoft.com/office/word/2010/wordprocessingGroup" xmlns:wpi="http://schemas.microsoft.com/office/word/2010/wordprocessingInk" xmlns:wne="http://schemas.microsoft.com/office/word/2006/wordml" xmlns:wps="http://schemas.microsoft.com/office/word/2010/wordprocessingShape" mc:Ignorable="w14 w15 w16se w16cid w16 w16cex w16sdtdh w16sdtfl w16du wp14">
   <w:p>
     <w:pPr>
       <w:pStyle w:val="Header"/>
@@ -7942,7 +7934,7 @@
 </file>
 
 <file path=word/header3.xml><?xml version="1.0" encoding="utf-8"?>
-<w:hdr xmlns:wpc="http://schemas.microsoft.com/office/word/2010/wordprocessingCanvas" xmlns:cx="http://schemas.microsoft.com/office/drawing/2014/chartex" xmlns:cx1="http://schemas.microsoft.com/office/drawing/2015/9/8/chartex" xmlns:cx2="http://schemas.microsoft.com/office/drawing/2015/10/21/chartex" xmlns:cx3="http://schemas.microsoft.com/office/drawing/2016/5/9/chartex" xmlns:cx4="http://schemas.microsoft.com/office/drawing/2016/5/10/chartex" xmlns:cx5="http://schemas.microsoft.com/office/drawing/2016/5/11/chartex" xmlns:cx6="http://schemas.microsoft.com/office/drawing/2016/5/12/chartex" xmlns:cx7="http://schemas.microsoft.com/office/drawing/2016/5/13/chartex" xmlns:cx8="http://schemas.microsoft.com/office/drawing/2016/5/14/chartex" xmlns:mc="http://schemas.openxmlformats.org/markup-compatibility/2006" xmlns:aink="http://schemas.microsoft.com/office/drawing/2016/ink" xmlns:am3d="http://schemas.microsoft.com/office/drawing/2017/model3d" xmlns:o="urn:schemas-microsoft-com:office:office" xmlns:oel="http://schemas.microsoft.com/office/2019/extlst" xmlns:r="http://schemas.openxmlformats.org/officeDocument/2006/relationships" xmlns:m="http://schemas.openxmlformats.org/officeDocument/2006/math" xmlns:v="urn:schemas-microsoft-com:vml" xmlns:wp14="http://schemas.microsoft.com/office/word/2010/wordprocessingDrawing" xmlns:wp="http://schemas.openxmlformats.org/drawingml/2006/wordprocessingDrawing" xmlns:w10="urn:schemas-microsoft-com:office:word" xmlns:w="http://schemas.openxmlformats.org/wordprocessingml/2006/main" xmlns:w14="http://schemas.microsoft.com/office/word/2010/wordml" xmlns:w15="http://schemas.microsoft.com/office/word/2012/wordml" xmlns:w16cei="http://schemas.microsoft.com/office/word/2026/wordml/cei" xmlns:w16cex="http://schemas.microsoft.com/office/word/2018/wordml/cex" xmlns:w16cid="http://schemas.microsoft.com/office/word/2016/wordml/cid" xmlns:w16="http://schemas.microsoft.com/office/word/2018/wordml" xmlns:w16du="http://schemas.microsoft.com/office/word/2023/wordml/word16du" xmlns:w16sdtdh="http://schemas.microsoft.com/office/word/2020/wordml/sdtdatahash" xmlns:w16sdtfl="http://schemas.microsoft.com/office/word/2024/wordml/sdtformatlock" xmlns:w16se="http://schemas.microsoft.com/office/word/2015/wordml/symex" xmlns:wpg="http://schemas.microsoft.com/office/word/2010/wordprocessingGroup" xmlns:wpi="http://schemas.microsoft.com/office/word/2010/wordprocessingInk" xmlns:wne="http://schemas.microsoft.com/office/word/2006/wordml" xmlns:wps="http://schemas.microsoft.com/office/word/2010/wordprocessingShape" mc:Ignorable="w14 w15 w16se w16cid w16 w16cex w16sdtdh w16sdtfl w16du wp14">
+<w:hdr xmlns:wpc="http://schemas.microsoft.com/office/word/2010/wordprocessingCanvas" xmlns:cx="http://schemas.microsoft.com/office/drawing/2014/chartex" xmlns:cx1="http://schemas.microsoft.com/office/drawing/2015/9/8/chartex" xmlns:cx2="http://schemas.microsoft.com/office/drawing/2015/10/21/chartex" xmlns:cx3="http://schemas.microsoft.com/office/drawing/2016/5/9/chartex" xmlns:cx4="http://schemas.microsoft.com/office/drawing/2016/5/10/chartex" xmlns:cx5="http://schemas.microsoft.com/office/drawing/2016/5/11/chartex" xmlns:cx6="http://schemas.microsoft.com/office/drawing/2016/5/12/chartex" xmlns:cx7="http://schemas.microsoft.com/office/drawing/2016/5/13/chartex" xmlns:cx8="http://schemas.microsoft.com/office/drawing/2016/5/14/chartex" xmlns:mc="http://schemas.openxmlformats.org/markup-compatibility/2006" xmlns:aink="http://schemas.microsoft.com/office/drawing/2016/ink" xmlns:am3d="http://schemas.microsoft.com/office/drawing/2017/model3d" xmlns:o="urn:schemas-microsoft-com:office:office" xmlns:oel="http://schemas.microsoft.com/office/2019/extlst" xmlns:r="http://schemas.openxmlformats.org/officeDocument/2006/relationships" xmlns:m="http://schemas.openxmlformats.org/officeDocument/2006/math" xmlns:v="urn:schemas-microsoft-com:vml" xmlns:wp14="http://schemas.microsoft.com/office/word/2010/wordprocessingDrawing" xmlns:wp="http://schemas.openxmlformats.org/drawingml/2006/wordprocessingDrawing" xmlns:w10="urn:schemas-microsoft-com:office:word" xmlns:w="http://schemas.openxmlformats.org/wordprocessingml/2006/main" xmlns:w14="http://schemas.microsoft.com/office/word/2010/wordml" xmlns:w15="http://schemas.microsoft.com/office/word/2012/wordml" xmlns:w16cex="http://schemas.microsoft.com/office/word/2018/wordml/cex" xmlns:w16cid="http://schemas.microsoft.com/office/word/2016/wordml/cid" xmlns:w16="http://schemas.microsoft.com/office/word/2018/wordml" xmlns:w16du="http://schemas.microsoft.com/office/word/2023/wordml/word16du" xmlns:w16sdtdh="http://schemas.microsoft.com/office/word/2020/wordml/sdtdatahash" xmlns:w16sdtfl="http://schemas.microsoft.com/office/word/2024/wordml/sdtformatlock" xmlns:w16se="http://schemas.microsoft.com/office/word/2015/wordml/symex" xmlns:wpg="http://schemas.microsoft.com/office/word/2010/wordprocessingGroup" xmlns:wpi="http://schemas.microsoft.com/office/word/2010/wordprocessingInk" xmlns:wne="http://schemas.microsoft.com/office/word/2006/wordml" xmlns:wps="http://schemas.microsoft.com/office/word/2010/wordprocessingShape" mc:Ignorable="w14 w15 w16se w16cid w16 w16cex w16sdtdh w16sdtfl w16du wp14">
   <w:p>
     <w:pPr>
       <w:pStyle w:val="Header"/>
@@ -7952,7 +7944,7 @@
 </file>
 
 <file path=word/numbering.xml><?xml version="1.0" encoding="utf-8"?>
-<w:numbering xmlns:wpc="http://schemas.microsoft.com/office/word/2010/wordprocessingCanvas" xmlns:cx="http://schemas.microsoft.com/office/drawing/2014/chartex" xmlns:cx1="http://schemas.microsoft.com/office/drawing/2015/9/8/chartex" xmlns:cx2="http://schemas.microsoft.com/office/drawing/2015/10/21/chartex" xmlns:cx3="http://schemas.microsoft.com/office/drawing/2016/5/9/chartex" xmlns:cx4="http://schemas.microsoft.com/office/drawing/2016/5/10/chartex" xmlns:cx5="http://schemas.microsoft.com/office/drawing/2016/5/11/chartex" xmlns:cx6="http://schemas.microsoft.com/office/drawing/2016/5/12/chartex" xmlns:cx7="http://schemas.microsoft.com/office/drawing/2016/5/13/chartex" xmlns:cx8="http://schemas.microsoft.com/office/drawing/2016/5/14/chartex" xmlns:mc="http://schemas.openxmlformats.org/markup-compatibility/2006" xmlns:aink="http://schemas.microsoft.com/office/drawing/2016/ink" xmlns:am3d="http://schemas.microsoft.com/office/drawing/2017/model3d" xmlns:o="urn:schemas-microsoft-com:office:office" xmlns:oel="http://schemas.microsoft.com/office/2019/extlst" xmlns:r="http://schemas.openxmlformats.org/officeDocument/2006/relationships" xmlns:m="http://schemas.openxmlformats.org/officeDocument/2006/math" xmlns:v="urn:schemas-microsoft-com:vml" xmlns:wp14="http://schemas.microsoft.com/office/word/2010/wordprocessingDrawing" xmlns:wp="http://schemas.openxmlformats.org/drawingml/2006/wordprocessingDrawing" xmlns:w10="urn:schemas-microsoft-com:office:word" xmlns:w="http://schemas.openxmlformats.org/wordprocessingml/2006/main" xmlns:w14="http://schemas.microsoft.com/office/word/2010/wordml" xmlns:w15="http://schemas.microsoft.com/office/word/2012/wordml" xmlns:w16cei="http://schemas.microsoft.com/office/word/2026/wordml/cei" xmlns:w16cex="http://schemas.microsoft.com/office/word/2018/wordml/cex" xmlns:w16cid="http://schemas.microsoft.com/office/word/2016/wordml/cid" xmlns:w16="http://schemas.microsoft.com/office/word/2018/wordml" xmlns:w16du="http://schemas.microsoft.com/office/word/2023/wordml/word16du" xmlns:w16sdtdh="http://schemas.microsoft.com/office/word/2020/wordml/sdtdatahash" xmlns:w16sdtfl="http://schemas.microsoft.com/office/word/2024/wordml/sdtformatlock" xmlns:w16se="http://schemas.microsoft.com/office/word/2015/wordml/symex" xmlns:wpg="http://schemas.microsoft.com/office/word/2010/wordprocessingGroup" xmlns:wpi="http://schemas.microsoft.com/office/word/2010/wordprocessingInk" xmlns:wne="http://schemas.microsoft.com/office/word/2006/wordml" xmlns:wps="http://schemas.microsoft.com/office/word/2010/wordprocessingShape" mc:Ignorable="w14 w15 w16se w16cid w16 w16cex w16sdtdh w16sdtfl w16du wp14">
+<w:numbering xmlns:wpc="http://schemas.microsoft.com/office/word/2010/wordprocessingCanvas" xmlns:cx="http://schemas.microsoft.com/office/drawing/2014/chartex" xmlns:cx1="http://schemas.microsoft.com/office/drawing/2015/9/8/chartex" xmlns:cx2="http://schemas.microsoft.com/office/drawing/2015/10/21/chartex" xmlns:cx3="http://schemas.microsoft.com/office/drawing/2016/5/9/chartex" xmlns:cx4="http://schemas.microsoft.com/office/drawing/2016/5/10/chartex" xmlns:cx5="http://schemas.microsoft.com/office/drawing/2016/5/11/chartex" xmlns:cx6="http://schemas.microsoft.com/office/drawing/2016/5/12/chartex" xmlns:cx7="http://schemas.microsoft.com/office/drawing/2016/5/13/chartex" xmlns:cx8="http://schemas.microsoft.com/office/drawing/2016/5/14/chartex" xmlns:mc="http://schemas.openxmlformats.org/markup-compatibility/2006" xmlns:aink="http://schemas.microsoft.com/office/drawing/2016/ink" xmlns:am3d="http://schemas.microsoft.com/office/drawing/2017/model3d" xmlns:o="urn:schemas-microsoft-com:office:office" xmlns:oel="http://schemas.microsoft.com/office/2019/extlst" xmlns:r="http://schemas.openxmlformats.org/officeDocument/2006/relationships" xmlns:m="http://schemas.openxmlformats.org/officeDocument/2006/math" xmlns:v="urn:schemas-microsoft-com:vml" xmlns:wp14="http://schemas.microsoft.com/office/word/2010/wordprocessingDrawing" xmlns:wp="http://schemas.openxmlformats.org/drawingml/2006/wordprocessingDrawing" xmlns:w10="urn:schemas-microsoft-com:office:word" xmlns:w="http://schemas.openxmlformats.org/wordprocessingml/2006/main" xmlns:w14="http://schemas.microsoft.com/office/word/2010/wordml" xmlns:w15="http://schemas.microsoft.com/office/word/2012/wordml" xmlns:w16cex="http://schemas.microsoft.com/office/word/2018/wordml/cex" xmlns:w16cid="http://schemas.microsoft.com/office/word/2016/wordml/cid" xmlns:w16="http://schemas.microsoft.com/office/word/2018/wordml" xmlns:w16du="http://schemas.microsoft.com/office/word/2023/wordml/word16du" xmlns:w16sdtdh="http://schemas.microsoft.com/office/word/2020/wordml/sdtdatahash" xmlns:w16sdtfl="http://schemas.microsoft.com/office/word/2024/wordml/sdtformatlock" xmlns:w16se="http://schemas.microsoft.com/office/word/2015/wordml/symex" xmlns:wpg="http://schemas.microsoft.com/office/word/2010/wordprocessingGroup" xmlns:wpi="http://schemas.microsoft.com/office/word/2010/wordprocessingInk" xmlns:wne="http://schemas.microsoft.com/office/word/2006/wordml" xmlns:wps="http://schemas.microsoft.com/office/word/2010/wordprocessingShape" mc:Ignorable="w14 w15 w16se w16cid w16 w16cex w16sdtdh w16sdtfl w16du wp14">
   <w:abstractNum w:abstractNumId="0" w15:restartNumberingAfterBreak="0">
     <w:nsid w:val="FFFFFF7C"/>
     <w:multiLevelType w:val="singleLevel"/>

</xml_diff>